<commit_message>
Update repository link in final report
</commit_message>
<xml_diff>
--- a/SDA-Pro 54481,54523 project report.docx
+++ b/SDA-Pro 54481,54523 project report.docx
@@ -245,7 +245,7 @@
           </mc:Choice>
           <mc:Fallback>
             <w:pict>
-              <v:line w14:anchorId="2058EE27" id="Straight Connector 3" o:spid="_x0000_s1026" style="position:absolute;z-index:251656192;visibility:visible;mso-wrap-style:square;mso-width-percent:0;mso-height-percent:0;mso-wrap-distance-left:9pt;mso-wrap-distance-top:0;mso-wrap-distance-right:9pt;mso-wrap-distance-bottom:0;mso-position-horizontal:absolute;mso-position-horizontal-relative:text;mso-position-vertical:absolute;mso-position-vertical-relative:text;mso-width-percent:0;mso-height-percent:0;mso-width-relative:margin;mso-height-relative:margin" from="6pt,14.65pt" to="517.8pt,14.65pt" o:gfxdata="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" strokeweight="1.5pt">
+              <v:line w14:anchorId="58ACE491" id="Straight Connector 3" o:spid="_x0000_s1026" style="position:absolute;z-index:251656192;visibility:visible;mso-wrap-style:square;mso-width-percent:0;mso-height-percent:0;mso-wrap-distance-left:9pt;mso-wrap-distance-top:0;mso-wrap-distance-right:9pt;mso-wrap-distance-bottom:0;mso-position-horizontal:absolute;mso-position-horizontal-relative:text;mso-position-vertical:absolute;mso-position-vertical-relative:text;mso-width-percent:0;mso-height-percent:0;mso-width-relative:margin;mso-height-relative:margin" from="6pt,14.65pt" to="517.8pt,14.65pt" o:gfxdata="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" strokeweight="1.5pt">
                 <w10:wrap type="topAndBottom"/>
               </v:line>
             </w:pict>
@@ -1300,23 +1300,7 @@
                 <w:rFonts w:ascii="Times New Roman" w:hAnsi="Times New Roman" w:cs="Times New Roman"/>
                 <w:sz w:val="19"/>
               </w:rPr>
-              <w:t xml:space="preserve">Repository </w:t>
-            </w:r>
-            <w:proofErr w:type="gramStart"/>
-            <w:r>
-              <w:rPr>
-                <w:rFonts w:ascii="Times New Roman" w:hAnsi="Times New Roman" w:cs="Times New Roman"/>
-                <w:sz w:val="19"/>
-              </w:rPr>
-              <w:t>contains .gitignore</w:t>
-            </w:r>
-            <w:proofErr w:type="gramEnd"/>
-            <w:r>
-              <w:rPr>
-                <w:rFonts w:ascii="Times New Roman" w:hAnsi="Times New Roman" w:cs="Times New Roman"/>
-                <w:sz w:val="19"/>
-              </w:rPr>
-              <w:t>, documentation structure, and clean files</w:t>
+              <w:t>Repository contains .gitignore, documentation structure, and clean files</w:t>
             </w:r>
             <w:r>
               <w:rPr>
@@ -1496,6 +1480,7 @@
       <w:r>
         <w:rPr>
           <w:rFonts w:ascii="Times New Roman" w:hAnsi="Times New Roman" w:cs="Times New Roman"/>
+          <w:noProof/>
         </w:rPr>
         <w:drawing>
           <wp:inline distT="0" distB="0" distL="0" distR="0" wp14:anchorId="399A1479" wp14:editId="0D8B128C">
@@ -4265,14 +4250,7 @@
           <w:rFonts w:ascii="Times New Roman" w:hAnsi="Times New Roman" w:cs="Times New Roman"/>
           <w:color w:val="auto"/>
         </w:rPr>
-        <w:t>8.</w:t>
-      </w:r>
-      <w:r>
-        <w:rPr>
-          <w:rFonts w:ascii="Times New Roman" w:hAnsi="Times New Roman" w:cs="Times New Roman"/>
-          <w:color w:val="auto"/>
-        </w:rPr>
-        <w:t>Acceptance Criteria Matrix</w:t>
+        <w:t>8.Acceptance Criteria Matrix</w:t>
       </w:r>
     </w:p>
     <w:tbl>

</xml_diff>